<commit_message>
small fix for 1 task
</commit_message>
<xml_diff>
--- a/phase-1/Отчёт.docx
+++ b/phase-1/Отчёт.docx
@@ -57,13 +57,7 @@
         <w:rPr>
           <w:lang w:val="ru-RU"/>
         </w:rPr>
-        <w:t xml:space="preserve">На начальном этапе были сформулированы четыре концепции программных продуктов, которые сравнивались для выбора наиболее подходящей темы дальнейшей </w:t>
-      </w:r>
-      <w:r>
-        <w:rPr>
-          <w:lang w:val="ru-RU"/>
-        </w:rPr>
-        <w:t>разработки:</w:t>
+        <w:t>На начальном этапе были сформулированы четыре концепции программных продуктов, которые сравнивались для выбора наиболее подходящей темы дальнейшей разработки:</w:t>
       </w:r>
     </w:p>
     <w:tbl>
@@ -104,12 +98,28 @@
             <w:vAlign w:val="center"/>
           </w:tcPr>
           <w:p>
+            <w:proofErr w:type="spellStart"/>
             <w:r>
               <w:rPr>
                 <w:b/>
               </w:rPr>
-              <w:t>Краткое название</w:t>
+              <w:t>Краткое</w:t>
             </w:r>
+            <w:proofErr w:type="spellEnd"/>
+            <w:r>
+              <w:rPr>
+                <w:b/>
+              </w:rPr>
+              <w:t xml:space="preserve"> </w:t>
+            </w:r>
+            <w:proofErr w:type="spellStart"/>
+            <w:r>
+              <w:rPr>
+                <w:b/>
+              </w:rPr>
+              <w:t>название</w:t>
+            </w:r>
+            <w:proofErr w:type="spellEnd"/>
           </w:p>
         </w:tc>
         <w:tc>
@@ -118,12 +128,14 @@
             <w:vAlign w:val="center"/>
           </w:tcPr>
           <w:p>
+            <w:proofErr w:type="spellStart"/>
             <w:r>
               <w:rPr>
                 <w:b/>
               </w:rPr>
               <w:t>Описание</w:t>
             </w:r>
+            <w:proofErr w:type="spellEnd"/>
           </w:p>
         </w:tc>
       </w:tr>
@@ -137,9 +149,27 @@
             <w:vAlign w:val="center"/>
           </w:tcPr>
           <w:p>
+            <w:proofErr w:type="spellStart"/>
             <w:r>
-              <w:t>Менеджер гарантийных сроков</w:t>
+              <w:t>Менеджер</w:t>
             </w:r>
+            <w:proofErr w:type="spellEnd"/>
+            <w:r>
+              <w:t xml:space="preserve"> </w:t>
+            </w:r>
+            <w:proofErr w:type="spellStart"/>
+            <w:r>
+              <w:t>гарантийных</w:t>
+            </w:r>
+            <w:proofErr w:type="spellEnd"/>
+            <w:r>
+              <w:t xml:space="preserve"> </w:t>
+            </w:r>
+            <w:proofErr w:type="spellStart"/>
+            <w:r>
+              <w:t>сроков</w:t>
+            </w:r>
+            <w:proofErr w:type="spellEnd"/>
           </w:p>
         </w:tc>
         <w:tc>
@@ -148,9 +178,11 @@
             <w:vAlign w:val="center"/>
           </w:tcPr>
           <w:p>
+            <w:proofErr w:type="spellStart"/>
             <w:r>
               <w:t>Гарантия</w:t>
             </w:r>
+            <w:proofErr w:type="spellEnd"/>
           </w:p>
         </w:tc>
         <w:tc>
@@ -224,13 +256,7 @@
               <w:rPr>
                 <w:lang w:val="ru-RU"/>
               </w:rPr>
-              <w:t xml:space="preserve">Сервис для поиска </w:t>
-            </w:r>
-            <w:r>
-              <w:rPr>
-                <w:lang w:val="ru-RU"/>
-              </w:rPr>
-              <w:t>попутчиков и подбора поездок с учётом маршрутов и расписания.</w:t>
+              <w:t>Сервис для поиска попутчиков и подбора поездок с учётом маршрутов и расписания.</w:t>
             </w:r>
           </w:p>
         </w:tc>
@@ -312,10 +338,7 @@
             </w:r>
             <w:proofErr w:type="spellStart"/>
             <w:r>
-              <w:t>д</w:t>
-            </w:r>
-            <w:r>
-              <w:t>оски</w:t>
+              <w:t>доски</w:t>
             </w:r>
             <w:proofErr w:type="spellEnd"/>
           </w:p>
@@ -326,9 +349,11 @@
             <w:vAlign w:val="center"/>
           </w:tcPr>
           <w:p>
+            <w:proofErr w:type="spellStart"/>
             <w:r>
               <w:t>Таск-трекер</w:t>
             </w:r>
+            <w:proofErr w:type="spellEnd"/>
           </w:p>
         </w:tc>
         <w:tc>
@@ -397,13 +422,7 @@
         <w:rPr>
           <w:lang w:val="ru-RU"/>
         </w:rPr>
-        <w:t xml:space="preserve">Конкурентоспособность — предполагаемая способность продукта конкурировать с </w:t>
-      </w:r>
-      <w:r>
-        <w:rPr>
-          <w:lang w:val="ru-RU"/>
-        </w:rPr>
-        <w:t>существующими решениями и быть востребованным целевой аудиторией.</w:t>
+        <w:t>Конкурентоспособность — предполагаемая способность продукта конкурировать с существующими решениями и быть востребованным целевой аудиторией.</w:t>
       </w:r>
     </w:p>
     <w:p>
@@ -431,13 +450,7 @@
         <w:rPr>
           <w:lang w:val="ru-RU"/>
         </w:rPr>
-        <w:t>Масштабируемость — возможность расширять функциональность и увели</w:t>
-      </w:r>
-      <w:r>
-        <w:rPr>
-          <w:lang w:val="ru-RU"/>
-        </w:rPr>
-        <w:t>чивать нагрузку по мере развития проекта.</w:t>
+        <w:t>Масштабируемость — возможность расширять функциональность и увеличивать нагрузку по мере развития проекта.</w:t>
       </w:r>
     </w:p>
     <w:p>
@@ -473,13 +486,7 @@
         <w:rPr>
           <w:lang w:val="ru-RU"/>
         </w:rPr>
-        <w:t xml:space="preserve"> критерии оценивались экспертами по лингвистической шкале, представленной трёхточечными нечёткими числами: «Низкий» — (1, </w:t>
-      </w:r>
-      <w:r>
-        <w:rPr>
-          <w:lang w:val="ru-RU"/>
-        </w:rPr>
-        <w:t xml:space="preserve">3, 5), «Средний» — (3, 5, 7), «Высокий» — (5, 7, 9). В таблице </w:t>
+        <w:t xml:space="preserve"> критерии оценивались экспертами по лингвистической шкале, представленной трёхточечными нечёткими числами: «Низкий» — (1, 3, 5), «Средний» — (3, 5, 7), «Высокий» — (5, 7, 9). В таблице </w:t>
       </w:r>
       <w:r>
         <w:t>MAI</w:t>
@@ -518,34 +525,7 @@
         <w:rPr>
           <w:lang w:val="ru-RU"/>
         </w:rPr>
-        <w:t xml:space="preserve">В файле </w:t>
-      </w:r>
-      <w:r>
-        <w:t>TOPSIS</w:t>
-      </w:r>
-      <w:r>
-        <w:rPr>
-          <w:lang w:val="ru-RU"/>
-        </w:rPr>
-        <w:t xml:space="preserve"> приведены оценки трёх экспертов/</w:t>
-      </w:r>
-      <w:r>
-        <w:rPr>
-          <w:lang w:val="ru-RU"/>
-        </w:rPr>
-        <w:t>исполнителей</w:t>
-      </w:r>
-      <w:r>
-        <w:rPr>
-          <w:lang w:val="ru-RU"/>
-        </w:rPr>
-        <w:t>: Попова, Стрельникова и Ячного. Каждый эксперт оценивал ч</w:t>
-      </w:r>
-      <w:r>
-        <w:rPr>
-          <w:lang w:val="ru-RU"/>
-        </w:rPr>
-        <w:t xml:space="preserve">етыре концепции по каждому из четырёх критериев. Лингвистические оценки преобразовывались в трёхточечные нечёткие числа, после чего </w:t>
+        <w:t xml:space="preserve">Каждый эксперт оценивал четыре концепции по каждому из четырёх критериев. Лингвистические оценки преобразовывались в трёхточечные нечёткие числа, после чего </w:t>
       </w:r>
       <w:proofErr w:type="spellStart"/>
       <w:r>
@@ -577,13 +557,7 @@
         <w:rPr>
           <w:lang w:val="ru-RU"/>
         </w:rPr>
-        <w:t xml:space="preserve">⁺ и идеально </w:t>
-      </w:r>
-      <w:r>
-        <w:rPr>
-          <w:lang w:val="ru-RU"/>
-        </w:rPr>
-        <w:t xml:space="preserve">негативное </w:t>
+        <w:t xml:space="preserve">⁺ и идеально негативное </w:t>
       </w:r>
       <w:r>
         <w:t>A</w:t>
@@ -632,8 +606,61 @@
         </w:rPr>
         <w:t xml:space="preserve">⁻). </w:t>
       </w:r>
+      <w:proofErr w:type="spellStart"/>
       <w:r>
-        <w:t>Чем ближе значение к единице, тем предпочтительнее альтернатива.</w:t>
+        <w:t>Чем</w:t>
+      </w:r>
+      <w:proofErr w:type="spellEnd"/>
+      <w:r>
+        <w:t xml:space="preserve"> </w:t>
+      </w:r>
+      <w:proofErr w:type="spellStart"/>
+      <w:r>
+        <w:t>ближе</w:t>
+      </w:r>
+      <w:proofErr w:type="spellEnd"/>
+      <w:r>
+        <w:t xml:space="preserve"> </w:t>
+      </w:r>
+      <w:proofErr w:type="spellStart"/>
+      <w:r>
+        <w:t>значение</w:t>
+      </w:r>
+      <w:proofErr w:type="spellEnd"/>
+      <w:r>
+        <w:t xml:space="preserve"> к </w:t>
+      </w:r>
+      <w:proofErr w:type="spellStart"/>
+      <w:r>
+        <w:t>единице</w:t>
+      </w:r>
+      <w:proofErr w:type="spellEnd"/>
+      <w:r>
+        <w:t xml:space="preserve">, </w:t>
+      </w:r>
+      <w:proofErr w:type="spellStart"/>
+      <w:r>
+        <w:t>тем</w:t>
+      </w:r>
+      <w:proofErr w:type="spellEnd"/>
+      <w:r>
+        <w:t xml:space="preserve"> </w:t>
+      </w:r>
+      <w:proofErr w:type="spellStart"/>
+      <w:r>
+        <w:t>предпочтительнее</w:t>
+      </w:r>
+      <w:proofErr w:type="spellEnd"/>
+      <w:r>
+        <w:t xml:space="preserve"> </w:t>
+      </w:r>
+      <w:proofErr w:type="spellStart"/>
+      <w:r>
+        <w:t>альтернатива</w:t>
+      </w:r>
+      <w:proofErr w:type="spellEnd"/>
+      <w:r>
+        <w:t>.</w:t>
       </w:r>
     </w:p>
     <w:tbl>
@@ -658,12 +685,14 @@
             <w:vAlign w:val="center"/>
           </w:tcPr>
           <w:p>
+            <w:proofErr w:type="spellStart"/>
             <w:r>
               <w:rPr>
                 <w:b/>
               </w:rPr>
               <w:t>Альтернатива</w:t>
             </w:r>
+            <w:proofErr w:type="spellEnd"/>
           </w:p>
         </w:tc>
         <w:tc>
@@ -672,12 +701,14 @@
             <w:vAlign w:val="center"/>
           </w:tcPr>
           <w:p>
+            <w:proofErr w:type="spellStart"/>
             <w:r>
               <w:rPr>
                 <w:b/>
               </w:rPr>
               <w:t>Cci</w:t>
             </w:r>
+            <w:proofErr w:type="spellEnd"/>
           </w:p>
         </w:tc>
         <w:tc>
@@ -686,12 +717,14 @@
             <w:vAlign w:val="center"/>
           </w:tcPr>
           <w:p>
+            <w:proofErr w:type="spellStart"/>
             <w:r>
               <w:rPr>
                 <w:b/>
               </w:rPr>
               <w:t>Ранг</w:t>
             </w:r>
+            <w:proofErr w:type="spellEnd"/>
           </w:p>
         </w:tc>
       </w:tr>
@@ -705,9 +738,11 @@
             <w:vAlign w:val="center"/>
           </w:tcPr>
           <w:p>
+            <w:proofErr w:type="spellStart"/>
             <w:r>
               <w:t>Карпулинг</w:t>
             </w:r>
+            <w:proofErr w:type="spellEnd"/>
           </w:p>
         </w:tc>
         <w:tc>
@@ -717,10 +752,7 @@
           </w:tcPr>
           <w:p>
             <w:r>
-              <w:t>0,94</w:t>
-            </w:r>
-            <w:r>
-              <w:t>4</w:t>
+              <w:t>0,944</w:t>
             </w:r>
           </w:p>
         </w:tc>
@@ -746,9 +778,11 @@
             <w:vAlign w:val="center"/>
           </w:tcPr>
           <w:p>
+            <w:proofErr w:type="spellStart"/>
             <w:r>
               <w:t>Инструменты</w:t>
             </w:r>
+            <w:proofErr w:type="spellEnd"/>
           </w:p>
         </w:tc>
         <w:tc>
@@ -784,9 +818,11 @@
             <w:vAlign w:val="center"/>
           </w:tcPr>
           <w:p>
+            <w:proofErr w:type="spellStart"/>
             <w:r>
               <w:t>Гарантия</w:t>
             </w:r>
+            <w:proofErr w:type="spellEnd"/>
           </w:p>
         </w:tc>
         <w:tc>
@@ -822,9 +858,11 @@
             <w:vAlign w:val="center"/>
           </w:tcPr>
           <w:p>
+            <w:proofErr w:type="spellStart"/>
             <w:r>
               <w:t>Таск-трекер</w:t>
             </w:r>
+            <w:proofErr w:type="spellEnd"/>
           </w:p>
         </w:tc>
         <w:tc>
@@ -885,13 +923,7 @@
         <w:rPr>
           <w:lang w:val="ru-RU"/>
         </w:rPr>
-        <w:t xml:space="preserve">» с показателем 0,944. Он оказался наиболее близок к идеальному решению, прежде всего благодаря высоким оценкам </w:t>
-      </w:r>
-      <w:r>
-        <w:rPr>
-          <w:lang w:val="ru-RU"/>
-        </w:rPr>
-        <w:t>конкурентоспособности, масштабируемости и потенциала монетизации. «Инструменты» заняли второе место, «Гарантия» — третье. На последнем месте оказался «Таск-</w:t>
+        <w:t>» с показателем 0,944. Он оказался наиболее близок к идеальному решению, прежде всего благодаря высоким оценкам конкурентоспособности, масштабируемости и потенциала монетизации. «Инструменты» заняли второе место, «Гарантия» — третье. На последнем месте оказался «Таск-</w:t>
       </w:r>
       <w:proofErr w:type="spellStart"/>
       <w:r>
@@ -906,45 +938,6 @@
           <w:lang w:val="ru-RU"/>
         </w:rPr>
         <w:t>».</w:t>
-      </w:r>
-    </w:p>
-    <w:p>
-      <w:pPr>
-        <w:rPr>
-          <w:lang w:val="ru-RU"/>
-        </w:rPr>
-      </w:pPr>
-      <w:r>
-        <w:rPr>
-          <w:lang w:val="ru-RU"/>
-        </w:rPr>
-        <w:t xml:space="preserve">В расчётной таблице </w:t>
-      </w:r>
-      <w:r>
-        <w:t>TOPSIS</w:t>
-      </w:r>
-      <w:r>
-        <w:rPr>
-          <w:lang w:val="ru-RU"/>
-        </w:rPr>
-        <w:t xml:space="preserve"> веса критериев явно не вынесены в отдельную итоговую сводку. Поэ</w:t>
-      </w:r>
-      <w:r>
-        <w:rPr>
-          <w:lang w:val="ru-RU"/>
-        </w:rPr>
-        <w:t xml:space="preserve">тому в описании результатов приводится рейтинг и значения </w:t>
-      </w:r>
-      <w:proofErr w:type="spellStart"/>
-      <w:r>
-        <w:t>Cci</w:t>
-      </w:r>
-      <w:proofErr w:type="spellEnd"/>
-      <w:r>
-        <w:rPr>
-          <w:lang w:val="ru-RU"/>
-        </w:rPr>
-        <w:t xml:space="preserve"> непосредственно из итогового блока таблицы.</w:t>
       </w:r>
     </w:p>
     <w:p>
@@ -971,13 +964,7 @@
         <w:rPr>
           <w:lang w:val="ru-RU"/>
         </w:rPr>
-        <w:t xml:space="preserve">В МАИ альтернативы и критерии сравниваются попарно: эксперт указывает, какой из двух элементов важнее и насколько. На </w:t>
-      </w:r>
-      <w:r>
-        <w:rPr>
-          <w:lang w:val="ru-RU"/>
-        </w:rPr>
-        <w:t>основе матриц парных сравнений рассчитываются локальные приоритеты, а затем они объединяются с весами критериев в итоговую оценку альтернатив.</w:t>
+        <w:t>В МАИ альтернативы и критерии сравниваются попарно. На основе матриц парных сравнений рассчитываются локальные приоритеты, а затем они объединяются с весами критериев в итоговую оценку альтернатив.</w:t>
       </w:r>
     </w:p>
     <w:tbl>
@@ -1017,12 +1004,14 @@
             <w:vAlign w:val="center"/>
           </w:tcPr>
           <w:p>
+            <w:proofErr w:type="spellStart"/>
             <w:r>
               <w:rPr>
                 <w:b/>
               </w:rPr>
               <w:t>Вес</w:t>
             </w:r>
+            <w:proofErr w:type="spellEnd"/>
           </w:p>
         </w:tc>
       </w:tr>
@@ -1036,9 +1025,11 @@
             <w:vAlign w:val="center"/>
           </w:tcPr>
           <w:p>
+            <w:proofErr w:type="spellStart"/>
             <w:r>
               <w:t>Конкурентоспособность</w:t>
             </w:r>
+            <w:proofErr w:type="spellEnd"/>
           </w:p>
         </w:tc>
         <w:tc>
@@ -1063,9 +1054,19 @@
             <w:vAlign w:val="center"/>
           </w:tcPr>
           <w:p>
+            <w:proofErr w:type="spellStart"/>
             <w:r>
-              <w:t>Потенциал монетизации</w:t>
+              <w:t>Потенциал</w:t>
             </w:r>
+            <w:proofErr w:type="spellEnd"/>
+            <w:r>
+              <w:t xml:space="preserve"> </w:t>
+            </w:r>
+            <w:proofErr w:type="spellStart"/>
+            <w:r>
+              <w:t>монетизации</w:t>
+            </w:r>
+            <w:proofErr w:type="spellEnd"/>
           </w:p>
         </w:tc>
         <w:tc>
@@ -1090,9 +1091,11 @@
             <w:vAlign w:val="center"/>
           </w:tcPr>
           <w:p>
+            <w:proofErr w:type="spellStart"/>
             <w:r>
               <w:t>Масштабируемость</w:t>
             </w:r>
+            <w:proofErr w:type="spellEnd"/>
           </w:p>
         </w:tc>
         <w:tc>
@@ -1117,9 +1120,19 @@
             <w:vAlign w:val="center"/>
           </w:tcPr>
           <w:p>
+            <w:proofErr w:type="spellStart"/>
             <w:r>
-              <w:t>Простота реализации</w:t>
+              <w:t>Простота</w:t>
             </w:r>
+            <w:proofErr w:type="spellEnd"/>
+            <w:r>
+              <w:t xml:space="preserve"> </w:t>
+            </w:r>
+            <w:proofErr w:type="spellStart"/>
+            <w:r>
+              <w:t>реализации</w:t>
+            </w:r>
+            <w:proofErr w:type="spellEnd"/>
           </w:p>
         </w:tc>
         <w:tc>
@@ -1146,13 +1159,7 @@
         <w:rPr>
           <w:lang w:val="ru-RU"/>
         </w:rPr>
-        <w:t>Наибольший вес получила конкурентоспособность (54,92 %), затем потенциал монетизации (26,06 %). Масштабируемость имеет вес 13,09 %, а простота реализации — 5,93 %. Таким образом, в заданной системе предпочтений основное влияние</w:t>
-      </w:r>
-      <w:r>
-        <w:rPr>
-          <w:lang w:val="ru-RU"/>
-        </w:rPr>
-        <w:t xml:space="preserve"> на выбор оказывают конкурентоспособность и возможность монетизации.</w:t>
+        <w:t>Наибольший вес получила конкурентоспособность (54,92 %), затем потенциал монетизации (26,06 %). Масштабируемость имеет вес 13,09 %, а простота реализации — 5,93 %. Таким образом, в заданной системе предпочтений основное влияние на выбор оказывают конкурентоспособность и возможность монетизации.</w:t>
       </w:r>
     </w:p>
     <w:p>
@@ -1206,12 +1213,56 @@
             <w:vAlign w:val="center"/>
           </w:tcPr>
           <w:p>
+            <w:proofErr w:type="spellStart"/>
             <w:r>
               <w:rPr>
                 <w:b/>
               </w:rPr>
-              <w:t>Итоговое значение из файла</w:t>
+              <w:t>Итоговое</w:t>
             </w:r>
+            <w:proofErr w:type="spellEnd"/>
+            <w:r>
+              <w:rPr>
+                <w:b/>
+              </w:rPr>
+              <w:t xml:space="preserve"> </w:t>
+            </w:r>
+            <w:proofErr w:type="spellStart"/>
+            <w:r>
+              <w:rPr>
+                <w:b/>
+              </w:rPr>
+              <w:t>значение</w:t>
+            </w:r>
+            <w:proofErr w:type="spellEnd"/>
+            <w:r>
+              <w:rPr>
+                <w:b/>
+              </w:rPr>
+              <w:t xml:space="preserve"> </w:t>
+            </w:r>
+            <w:proofErr w:type="spellStart"/>
+            <w:r>
+              <w:rPr>
+                <w:b/>
+              </w:rPr>
+              <w:t>из</w:t>
+            </w:r>
+            <w:proofErr w:type="spellEnd"/>
+            <w:r>
+              <w:rPr>
+                <w:b/>
+              </w:rPr>
+              <w:t xml:space="preserve"> </w:t>
+            </w:r>
+            <w:proofErr w:type="spellStart"/>
+            <w:r>
+              <w:rPr>
+                <w:b/>
+              </w:rPr>
+              <w:t>файла</w:t>
+            </w:r>
+            <w:proofErr w:type="spellEnd"/>
           </w:p>
         </w:tc>
         <w:tc>
@@ -1220,12 +1271,42 @@
             <w:vAlign w:val="center"/>
           </w:tcPr>
           <w:p>
+            <w:proofErr w:type="spellStart"/>
             <w:r>
               <w:rPr>
                 <w:b/>
               </w:rPr>
-              <w:t>Место по значению</w:t>
+              <w:t>Место</w:t>
             </w:r>
+            <w:proofErr w:type="spellEnd"/>
+            <w:r>
+              <w:rPr>
+                <w:b/>
+              </w:rPr>
+              <w:t xml:space="preserve"> </w:t>
+            </w:r>
+            <w:proofErr w:type="spellStart"/>
+            <w:r>
+              <w:rPr>
+                <w:b/>
+              </w:rPr>
+              <w:t>по</w:t>
+            </w:r>
+            <w:proofErr w:type="spellEnd"/>
+            <w:r>
+              <w:rPr>
+                <w:b/>
+              </w:rPr>
+              <w:t xml:space="preserve"> </w:t>
+            </w:r>
+            <w:proofErr w:type="spellStart"/>
+            <w:r>
+              <w:rPr>
+                <w:b/>
+              </w:rPr>
+              <w:t>значению</w:t>
+            </w:r>
+            <w:proofErr w:type="spellEnd"/>
           </w:p>
         </w:tc>
       </w:tr>
@@ -1239,9 +1320,11 @@
             <w:vAlign w:val="center"/>
           </w:tcPr>
           <w:p>
+            <w:proofErr w:type="spellStart"/>
             <w:r>
               <w:t>Карпулинг</w:t>
             </w:r>
+            <w:proofErr w:type="spellEnd"/>
           </w:p>
         </w:tc>
         <w:tc>
@@ -1251,7 +1334,10 @@
           </w:tcPr>
           <w:p>
             <w:r>
-              <w:t>0,5258</w:t>
+              <w:t>0,</w:t>
+            </w:r>
+            <w:r>
+              <w:t>4802</w:t>
             </w:r>
           </w:p>
         </w:tc>
@@ -1277,9 +1363,11 @@
             <w:vAlign w:val="center"/>
           </w:tcPr>
           <w:p>
+            <w:proofErr w:type="spellStart"/>
             <w:r>
               <w:t>Гарантия</w:t>
             </w:r>
+            <w:proofErr w:type="spellEnd"/>
           </w:p>
         </w:tc>
         <w:tc>
@@ -1289,7 +1377,10 @@
           </w:tcPr>
           <w:p>
             <w:r>
-              <w:t>0,3145</w:t>
+              <w:t>0,</w:t>
+            </w:r>
+            <w:r>
+              <w:t>2656</w:t>
             </w:r>
           </w:p>
         </w:tc>
@@ -1315,9 +1406,11 @@
             <w:vAlign w:val="center"/>
           </w:tcPr>
           <w:p>
+            <w:proofErr w:type="spellStart"/>
             <w:r>
               <w:t>Инструменты</w:t>
             </w:r>
+            <w:proofErr w:type="spellEnd"/>
           </w:p>
         </w:tc>
         <w:tc>
@@ -1327,7 +1420,10 @@
           </w:tcPr>
           <w:p>
             <w:r>
-              <w:t>0,1876</w:t>
+              <w:t>0,1</w:t>
+            </w:r>
+            <w:r>
+              <w:t>677</w:t>
             </w:r>
           </w:p>
         </w:tc>
@@ -1353,9 +1449,11 @@
             <w:vAlign w:val="center"/>
           </w:tcPr>
           <w:p>
+            <w:proofErr w:type="spellStart"/>
             <w:r>
               <w:t>Таск-трекер</w:t>
             </w:r>
+            <w:proofErr w:type="spellEnd"/>
           </w:p>
         </w:tc>
         <w:tc>
@@ -1365,7 +1463,10 @@
           </w:tcPr>
           <w:p>
             <w:r>
-              <w:t>0,1083</w:t>
+              <w:t>0,</w:t>
+            </w:r>
+            <w:r>
+              <w:t>0866</w:t>
             </w:r>
           </w:p>
         </w:tc>
@@ -1382,27 +1483,6 @@
         </w:tc>
       </w:tr>
     </w:tbl>
-    <w:p/>
-    <w:p>
-      <w:pPr>
-        <w:rPr>
-          <w:lang w:val="ru-RU"/>
-        </w:rPr>
-      </w:pPr>
-      <w:r>
-        <w:rPr>
-          <w:lang w:val="ru-RU"/>
-        </w:rPr>
-        <w:lastRenderedPageBreak/>
-        <w:t>В расчётном файле значения в блоке итоговых весов не суммируются до 1, хотя столбец обозначен как «Вес в долях» и дублируется в «Вес в процентах». Поэтому для интерпретации использован только порядок альтернатив</w:t>
-      </w:r>
-      <w:r>
-        <w:rPr>
-          <w:lang w:val="ru-RU"/>
-        </w:rPr>
-        <w:t xml:space="preserve"> по указанным значениям; эти числа не следует трактовать как корректно нормированные вероятности или проценты.</w:t>
-      </w:r>
-    </w:p>
     <w:p>
       <w:pPr>
         <w:pStyle w:val="1"/>
@@ -1455,13 +1535,14 @@
         <w:rPr>
           <w:lang w:val="ru-RU"/>
         </w:rPr>
-        <w:t>» занимает последн</w:t>
+        <w:t xml:space="preserve">» занимает последнее место в обоих рейтингах. Это совпадение </w:t>
       </w:r>
       <w:r>
         <w:rPr>
           <w:lang w:val="ru-RU"/>
         </w:rPr>
-        <w:t>ее место в обоих рейтингах. Это совпадение поддерживает выбор сервиса для поиска попутчиков и подбора поездок как темы дальнейшей разработки.</w:t>
+        <w:lastRenderedPageBreak/>
+        <w:t>поддерживает выбор сервиса для поиска попутчиков и подбора поездок как темы дальнейшей разработки.</w:t>
       </w:r>
     </w:p>
     <w:tbl>
@@ -1506,8 +1587,30 @@
               <w:rPr>
                 <w:b/>
               </w:rPr>
-              <w:t>TOPSIS: Cci / ранг</w:t>
+              <w:t xml:space="preserve">TOPSIS: </w:t>
             </w:r>
+            <w:proofErr w:type="spellStart"/>
+            <w:r>
+              <w:rPr>
+                <w:b/>
+              </w:rPr>
+              <w:t>Cci</w:t>
+            </w:r>
+            <w:proofErr w:type="spellEnd"/>
+            <w:r>
+              <w:rPr>
+                <w:b/>
+              </w:rPr>
+              <w:t xml:space="preserve"> / </w:t>
+            </w:r>
+            <w:proofErr w:type="spellStart"/>
+            <w:r>
+              <w:rPr>
+                <w:b/>
+              </w:rPr>
+              <w:t>ранг</w:t>
+            </w:r>
+            <w:proofErr w:type="spellEnd"/>
           </w:p>
         </w:tc>
         <w:tc>
@@ -1520,8 +1623,30 @@
               <w:rPr>
                 <w:b/>
               </w:rPr>
-              <w:t>МАИ: значение / ранг</w:t>
+              <w:t xml:space="preserve">МАИ: </w:t>
             </w:r>
+            <w:proofErr w:type="spellStart"/>
+            <w:r>
+              <w:rPr>
+                <w:b/>
+              </w:rPr>
+              <w:t>значение</w:t>
+            </w:r>
+            <w:proofErr w:type="spellEnd"/>
+            <w:r>
+              <w:rPr>
+                <w:b/>
+              </w:rPr>
+              <w:t xml:space="preserve"> / </w:t>
+            </w:r>
+            <w:proofErr w:type="spellStart"/>
+            <w:r>
+              <w:rPr>
+                <w:b/>
+              </w:rPr>
+              <w:t>ранг</w:t>
+            </w:r>
+            <w:proofErr w:type="spellEnd"/>
           </w:p>
         </w:tc>
       </w:tr>
@@ -1535,9 +1660,11 @@
             <w:vAlign w:val="center"/>
           </w:tcPr>
           <w:p>
+            <w:proofErr w:type="spellStart"/>
             <w:r>
               <w:t>Карпулинг</w:t>
             </w:r>
+            <w:proofErr w:type="spellEnd"/>
           </w:p>
         </w:tc>
         <w:tc>
@@ -1558,7 +1685,13 @@
           </w:tcPr>
           <w:p>
             <w:r>
-              <w:t>0,5258 / 1</w:t>
+              <w:t>0,</w:t>
+            </w:r>
+            <w:r>
+              <w:t>4802</w:t>
+            </w:r>
+            <w:r>
+              <w:t>/ 1</w:t>
             </w:r>
           </w:p>
         </w:tc>
@@ -1573,9 +1706,11 @@
             <w:vAlign w:val="center"/>
           </w:tcPr>
           <w:p>
+            <w:proofErr w:type="spellStart"/>
             <w:r>
               <w:t>Инструменты</w:t>
             </w:r>
+            <w:proofErr w:type="spellEnd"/>
           </w:p>
         </w:tc>
         <w:tc>
@@ -1596,7 +1731,13 @@
           </w:tcPr>
           <w:p>
             <w:r>
-              <w:t>0,1876 / 3</w:t>
+              <w:t>0,</w:t>
+            </w:r>
+            <w:r>
+              <w:t>1677</w:t>
+            </w:r>
+            <w:r>
+              <w:t>/ 3</w:t>
             </w:r>
           </w:p>
         </w:tc>
@@ -1611,9 +1752,11 @@
             <w:vAlign w:val="center"/>
           </w:tcPr>
           <w:p>
+            <w:proofErr w:type="spellStart"/>
             <w:r>
               <w:t>Гарантия</w:t>
             </w:r>
+            <w:proofErr w:type="spellEnd"/>
           </w:p>
         </w:tc>
         <w:tc>
@@ -1634,7 +1777,13 @@
           </w:tcPr>
           <w:p>
             <w:r>
-              <w:t>0,3145 / 2</w:t>
+              <w:t>0,</w:t>
+            </w:r>
+            <w:r>
+              <w:t>2656</w:t>
+            </w:r>
+            <w:r>
+              <w:t>/ 2</w:t>
             </w:r>
           </w:p>
         </w:tc>
@@ -1649,9 +1798,11 @@
             <w:vAlign w:val="center"/>
           </w:tcPr>
           <w:p>
+            <w:proofErr w:type="spellStart"/>
             <w:r>
               <w:t>Таск-трекер</w:t>
             </w:r>
+            <w:proofErr w:type="spellEnd"/>
           </w:p>
         </w:tc>
         <w:tc>
@@ -1672,7 +1823,13 @@
           </w:tcPr>
           <w:p>
             <w:r>
-              <w:t>0,1083 / 4</w:t>
+              <w:t>0,</w:t>
+            </w:r>
+            <w:r>
+              <w:t>0866</w:t>
+            </w:r>
+            <w:r>
+              <w:t>/ 4</w:t>
             </w:r>
           </w:p>
         </w:tc>
@@ -1707,13 +1864,7 @@
         <w:rPr>
           <w:lang w:val="ru-RU"/>
         </w:rPr>
-        <w:t xml:space="preserve"> использует абс</w:t>
-      </w:r>
-      <w:r>
-        <w:rPr>
-          <w:lang w:val="ru-RU"/>
-        </w:rPr>
-        <w:t>олютные экспертные оценки и расстояния до идеальных решений, а МАИ — относительные попарные предпочтения и веса критериев.</w:t>
+        <w:t xml:space="preserve"> использует абсолютные экспертные оценки и расстояния до идеальных решений, а МАИ — относительные попарные предпочтения и веса критериев.</w:t>
       </w:r>
     </w:p>
     <w:p>
@@ -1754,13 +1905,7 @@
         <w:rPr>
           <w:lang w:val="ru-RU"/>
         </w:rPr>
-        <w:t>, сервис совме</w:t>
-      </w:r>
-      <w:r>
-        <w:rPr>
-          <w:lang w:val="ru-RU"/>
-        </w:rPr>
-        <w:t xml:space="preserve">стного использования инструментов и командный </w:t>
+        <w:t xml:space="preserve">, сервис совместного использования инструментов и командный </w:t>
       </w:r>
       <w:proofErr w:type="spellStart"/>
       <w:r>
@@ -1821,13 +1966,7 @@
         <w:rPr>
           <w:lang w:val="ru-RU"/>
         </w:rPr>
-        <w:t xml:space="preserve"> = 0,944. МАИ также</w:t>
-      </w:r>
-      <w:r>
-        <w:rPr>
-          <w:lang w:val="ru-RU"/>
-        </w:rPr>
-        <w:t xml:space="preserve"> поставил «</w:t>
+        <w:t xml:space="preserve"> = 0,944. МАИ также поставил «</w:t>
       </w:r>
       <w:proofErr w:type="spellStart"/>
       <w:r>
@@ -1868,13 +2007,7 @@
         <w:rPr>
           <w:lang w:val="ru-RU"/>
         </w:rPr>
-        <w:t>На основании полученных результатов</w:t>
-      </w:r>
-      <w:r>
-        <w:rPr>
-          <w:lang w:val="ru-RU"/>
-        </w:rPr>
-        <w:t xml:space="preserve"> для дальнейшей разработки выбирается сервис поиска попутчиков и маршрутов поездок («</w:t>
+        <w:t>На основании полученных результатов для дальнейшей разработки выбирается сервис поиска попутчиков и маршрутов поездок («</w:t>
       </w:r>
       <w:proofErr w:type="spellStart"/>
       <w:r>
@@ -1888,13 +2021,7 @@
         <w:rPr>
           <w:lang w:val="ru-RU"/>
         </w:rPr>
-        <w:t>»). При этом перед окончательным использованием результатов МАИ рекомендуется проверить формулы итогового блока весов: значения, указанные в файле, не нормированы</w:t>
-      </w:r>
-      <w:r>
-        <w:rPr>
-          <w:lang w:val="ru-RU"/>
-        </w:rPr>
-        <w:t xml:space="preserve"> до суммы 1.</w:t>
+        <w:t xml:space="preserve">»). </w:t>
       </w:r>
     </w:p>
     <w:sectPr>
@@ -2395,11 +2522,6 @@
     <w:lsdException w:name="Book Title" w:uiPriority="33" w:qFormat="1"/>
     <w:lsdException w:name="Bibliography" w:semiHidden="1" w:uiPriority="37" w:unhideWhenUsed="1"/>
     <w:lsdException w:name="TOC Heading" w:semiHidden="1" w:uiPriority="39" w:unhideWhenUsed="1" w:qFormat="1"/>
-    <w:lsdException w:name="Plain Table 5" w:semiHidden="1" w:unhideWhenUsed="1"/>
-    <w:lsdException w:name="Grid Table Light" w:semiHidden="1" w:unhideWhenUsed="1"/>
-    <w:lsdException w:name="Grid Table 1 Light" w:semiHidden="1" w:unhideWhenUsed="1"/>
-    <w:lsdException w:name="Grid Table 2" w:semiHidden="1" w:unhideWhenUsed="1"/>
-    <w:lsdException w:name="Grid Table 3" w:semiHidden="1" w:unhideWhenUsed="1"/>
     <w:lsdException w:name="Grid Table 4" w:uiPriority="49"/>
     <w:lsdException w:name="Grid Table 5 Dark" w:uiPriority="50"/>
     <w:lsdException w:name="Grid Table 6 Colorful" w:uiPriority="51"/>

</xml_diff>